<commit_message>
Update Word report formula layout
</commit_message>
<xml_diff>
--- a/report/term_project2_report_formatted.docx
+++ b/report/term_project2_report_formatted.docx
@@ -182,12 +182,42 @@
     </w:p>
     <w:p>
       <w:pPr>
+        <w:spacing w:after="160" w:line="276" w:lineRule="auto"/>
+      </w:pPr>
+      <w:r>
+        <w:rPr>
+          <w:rFonts w:ascii="Arial Unicode MS" w:hAnsi="Arial Unicode MS" w:eastAsia="Arial Unicode MS"/>
+          <w:b w:val="0"/>
+          <w:sz w:val="20"/>
+        </w:rPr>
+        <w:t>Problem 1 公式如下。項目名稱與說明使用 Word 原生文字排版，公式本身各自以單張 PNG 插入。</w:t>
+      </w:r>
+    </w:p>
+    <w:p>
+      <w:pPr>
+        <w:keepNext/>
+        <w:keepLines/>
+        <w:spacing w:before="80" w:after="40"/>
+      </w:pPr>
+      <w:r>
+        <w:rPr>
+          <w:rFonts w:ascii="Arial Unicode MS" w:hAnsi="Arial Unicode MS" w:eastAsia="Arial Unicode MS"/>
+          <w:b/>
+          <w:sz w:val="20"/>
+        </w:rPr>
+        <w:t>每檔參數</w:t>
+      </w:r>
+    </w:p>
+    <w:p>
+      <w:pPr>
+        <w:keepLines/>
+        <w:spacing w:after="100"/>
         <w:jc w:val="center"/>
       </w:pPr>
       <w:r>
         <w:drawing>
           <wp:inline xmlns:a="http://schemas.openxmlformats.org/drawingml/2006/main" xmlns:pic="http://schemas.openxmlformats.org/drawingml/2006/picture">
-            <wp:extent cx="5669280" cy="3990301"/>
+            <wp:extent cx="5349240" cy="389408"/>
             <wp:docPr id="1" name="Picture 1"/>
             <wp:cNvGraphicFramePr>
               <a:graphicFrameLocks noChangeAspect="1"/>
@@ -196,7 +226,7 @@
               <a:graphicData uri="http://schemas.openxmlformats.org/drawingml/2006/picture">
                 <pic:pic>
                   <pic:nvPicPr>
-                    <pic:cNvPr id="0" name="problem1_rule_formula_sheet.png"/>
+                    <pic:cNvPr id="0" name="problem1_01.png"/>
                     <pic:cNvPicPr/>
                   </pic:nvPicPr>
                   <pic:blipFill>
@@ -208,7 +238,7 @@
                   <pic:spPr>
                     <a:xfrm>
                       <a:off x="0" y="0"/>
-                      <a:ext cx="5669280" cy="3990301"/>
+                      <a:ext cx="5349240" cy="389408"/>
                     </a:xfrm>
                     <a:prstGeom prst="rect"/>
                   </pic:spPr>
@@ -221,16 +251,511 @@
     </w:p>
     <w:p>
       <w:pPr>
-        <w:spacing w:after="160"/>
-        <w:jc w:val="center"/>
+        <w:keepNext/>
+        <w:keepLines/>
+        <w:spacing w:before="80" w:after="40"/>
       </w:pPr>
       <w:r>
         <w:rPr>
           <w:rFonts w:ascii="Arial Unicode MS" w:hAnsi="Arial Unicode MS" w:eastAsia="Arial Unicode MS"/>
-          <w:i/>
-          <w:sz w:val="18"/>
+          <w:b/>
+          <w:sz w:val="20"/>
         </w:rPr>
-        <w:t>圖 1：Problem 1 個股規則公式。</w:t>
+        <w:t>AAPL 範例</w:t>
+      </w:r>
+    </w:p>
+    <w:p>
+      <w:pPr>
+        <w:keepLines/>
+        <w:spacing w:after="100"/>
+        <w:jc w:val="center"/>
+      </w:pPr>
+      <w:r>
+        <w:drawing>
+          <wp:inline xmlns:a="http://schemas.openxmlformats.org/drawingml/2006/main" xmlns:pic="http://schemas.openxmlformats.org/drawingml/2006/picture">
+            <wp:extent cx="5349240" cy="389408"/>
+            <wp:docPr id="2" name="Picture 2"/>
+            <wp:cNvGraphicFramePr>
+              <a:graphicFrameLocks noChangeAspect="1"/>
+            </wp:cNvGraphicFramePr>
+            <a:graphic>
+              <a:graphicData uri="http://schemas.openxmlformats.org/drawingml/2006/picture">
+                <pic:pic>
+                  <pic:nvPicPr>
+                    <pic:cNvPr id="0" name="problem1_02.png"/>
+                    <pic:cNvPicPr/>
+                  </pic:nvPicPr>
+                  <pic:blipFill>
+                    <a:blip r:embed="rId10"/>
+                    <a:stretch>
+                      <a:fillRect/>
+                    </a:stretch>
+                  </pic:blipFill>
+                  <pic:spPr>
+                    <a:xfrm>
+                      <a:off x="0" y="0"/>
+                      <a:ext cx="5349240" cy="389408"/>
+                    </a:xfrm>
+                    <a:prstGeom prst="rect"/>
+                  </pic:spPr>
+                </pic:pic>
+              </a:graphicData>
+            </a:graphic>
+          </wp:inline>
+        </w:drawing>
+      </w:r>
+    </w:p>
+    <w:p>
+      <w:pPr>
+        <w:keepNext/>
+        <w:keepLines/>
+        <w:spacing w:before="80" w:after="40"/>
+      </w:pPr>
+      <w:r>
+        <w:rPr>
+          <w:rFonts w:ascii="Arial Unicode MS" w:hAnsi="Arial Unicode MS" w:eastAsia="Arial Unicode MS"/>
+          <w:b/>
+          <w:sz w:val="20"/>
+        </w:rPr>
+        <w:t>移動平均</w:t>
+      </w:r>
+    </w:p>
+    <w:p>
+      <w:pPr>
+        <w:keepLines/>
+        <w:spacing w:after="100"/>
+        <w:jc w:val="center"/>
+      </w:pPr>
+      <w:r>
+        <w:drawing>
+          <wp:inline xmlns:a="http://schemas.openxmlformats.org/drawingml/2006/main" xmlns:pic="http://schemas.openxmlformats.org/drawingml/2006/picture">
+            <wp:extent cx="5349240" cy="481637"/>
+            <wp:docPr id="3" name="Picture 3"/>
+            <wp:cNvGraphicFramePr>
+              <a:graphicFrameLocks noChangeAspect="1"/>
+            </wp:cNvGraphicFramePr>
+            <a:graphic>
+              <a:graphicData uri="http://schemas.openxmlformats.org/drawingml/2006/picture">
+                <pic:pic>
+                  <pic:nvPicPr>
+                    <pic:cNvPr id="0" name="problem1_03.png"/>
+                    <pic:cNvPicPr/>
+                  </pic:nvPicPr>
+                  <pic:blipFill>
+                    <a:blip r:embed="rId11"/>
+                    <a:stretch>
+                      <a:fillRect/>
+                    </a:stretch>
+                  </pic:blipFill>
+                  <pic:spPr>
+                    <a:xfrm>
+                      <a:off x="0" y="0"/>
+                      <a:ext cx="5349240" cy="481637"/>
+                    </a:xfrm>
+                    <a:prstGeom prst="rect"/>
+                  </pic:spPr>
+                </pic:pic>
+              </a:graphicData>
+            </a:graphic>
+          </wp:inline>
+        </w:drawing>
+      </w:r>
+    </w:p>
+    <w:p>
+      <w:pPr>
+        <w:keepNext/>
+        <w:keepLines/>
+        <w:spacing w:before="80" w:after="40"/>
+      </w:pPr>
+      <w:r>
+        <w:rPr>
+          <w:rFonts w:ascii="Arial Unicode MS" w:hAnsi="Arial Unicode MS" w:eastAsia="Arial Unicode MS"/>
+          <w:b/>
+          <w:sz w:val="20"/>
+        </w:rPr>
+        <w:t>動能</w:t>
+      </w:r>
+    </w:p>
+    <w:p>
+      <w:pPr>
+        <w:keepLines/>
+        <w:spacing w:after="100"/>
+        <w:jc w:val="center"/>
+      </w:pPr>
+      <w:r>
+        <w:drawing>
+          <wp:inline xmlns:a="http://schemas.openxmlformats.org/drawingml/2006/main" xmlns:pic="http://schemas.openxmlformats.org/drawingml/2006/picture">
+            <wp:extent cx="5349240" cy="389408"/>
+            <wp:docPr id="4" name="Picture 4"/>
+            <wp:cNvGraphicFramePr>
+              <a:graphicFrameLocks noChangeAspect="1"/>
+            </wp:cNvGraphicFramePr>
+            <a:graphic>
+              <a:graphicData uri="http://schemas.openxmlformats.org/drawingml/2006/picture">
+                <pic:pic>
+                  <pic:nvPicPr>
+                    <pic:cNvPr id="0" name="problem1_04.png"/>
+                    <pic:cNvPicPr/>
+                  </pic:nvPicPr>
+                  <pic:blipFill>
+                    <a:blip r:embed="rId12"/>
+                    <a:stretch>
+                      <a:fillRect/>
+                    </a:stretch>
+                  </pic:blipFill>
+                  <pic:spPr>
+                    <a:xfrm>
+                      <a:off x="0" y="0"/>
+                      <a:ext cx="5349240" cy="389408"/>
+                    </a:xfrm>
+                    <a:prstGeom prst="rect"/>
+                  </pic:spPr>
+                </pic:pic>
+              </a:graphicData>
+            </a:graphic>
+          </wp:inline>
+        </w:drawing>
+      </w:r>
+    </w:p>
+    <w:p>
+      <w:pPr>
+        <w:keepNext/>
+        <w:keepLines/>
+        <w:spacing w:before="80" w:after="40"/>
+      </w:pPr>
+      <w:r>
+        <w:rPr>
+          <w:rFonts w:ascii="Arial Unicode MS" w:hAnsi="Arial Unicode MS" w:eastAsia="Arial Unicode MS"/>
+          <w:b/>
+          <w:sz w:val="20"/>
+        </w:rPr>
+        <w:t>持有高點</w:t>
+      </w:r>
+    </w:p>
+    <w:p>
+      <w:pPr>
+        <w:keepLines/>
+        <w:spacing w:after="100"/>
+        <w:jc w:val="center"/>
+      </w:pPr>
+      <w:r>
+        <w:drawing>
+          <wp:inline xmlns:a="http://schemas.openxmlformats.org/drawingml/2006/main" xmlns:pic="http://schemas.openxmlformats.org/drawingml/2006/picture">
+            <wp:extent cx="5349240" cy="389408"/>
+            <wp:docPr id="5" name="Picture 5"/>
+            <wp:cNvGraphicFramePr>
+              <a:graphicFrameLocks noChangeAspect="1"/>
+            </wp:cNvGraphicFramePr>
+            <a:graphic>
+              <a:graphicData uri="http://schemas.openxmlformats.org/drawingml/2006/picture">
+                <pic:pic>
+                  <pic:nvPicPr>
+                    <pic:cNvPr id="0" name="problem1_05.png"/>
+                    <pic:cNvPicPr/>
+                  </pic:nvPicPr>
+                  <pic:blipFill>
+                    <a:blip r:embed="rId13"/>
+                    <a:stretch>
+                      <a:fillRect/>
+                    </a:stretch>
+                  </pic:blipFill>
+                  <pic:spPr>
+                    <a:xfrm>
+                      <a:off x="0" y="0"/>
+                      <a:ext cx="5349240" cy="389408"/>
+                    </a:xfrm>
+                    <a:prstGeom prst="rect"/>
+                  </pic:spPr>
+                </pic:pic>
+              </a:graphicData>
+            </a:graphic>
+          </wp:inline>
+        </w:drawing>
+      </w:r>
+    </w:p>
+    <w:p>
+      <w:pPr>
+        <w:keepNext/>
+        <w:keepLines/>
+        <w:spacing w:before="80" w:after="40"/>
+      </w:pPr>
+      <w:r>
+        <w:rPr>
+          <w:rFonts w:ascii="Arial Unicode MS" w:hAnsi="Arial Unicode MS" w:eastAsia="Arial Unicode MS"/>
+          <w:b/>
+          <w:sz w:val="20"/>
+        </w:rPr>
+        <w:t>回撤</w:t>
+      </w:r>
+    </w:p>
+    <w:p>
+      <w:pPr>
+        <w:keepLines/>
+        <w:spacing w:after="100"/>
+        <w:jc w:val="center"/>
+      </w:pPr>
+      <w:r>
+        <w:drawing>
+          <wp:inline xmlns:a="http://schemas.openxmlformats.org/drawingml/2006/main" xmlns:pic="http://schemas.openxmlformats.org/drawingml/2006/picture">
+            <wp:extent cx="5349240" cy="389408"/>
+            <wp:docPr id="6" name="Picture 6"/>
+            <wp:cNvGraphicFramePr>
+              <a:graphicFrameLocks noChangeAspect="1"/>
+            </wp:cNvGraphicFramePr>
+            <a:graphic>
+              <a:graphicData uri="http://schemas.openxmlformats.org/drawingml/2006/picture">
+                <pic:pic>
+                  <pic:nvPicPr>
+                    <pic:cNvPr id="0" name="problem1_06.png"/>
+                    <pic:cNvPicPr/>
+                  </pic:nvPicPr>
+                  <pic:blipFill>
+                    <a:blip r:embed="rId14"/>
+                    <a:stretch>
+                      <a:fillRect/>
+                    </a:stretch>
+                  </pic:blipFill>
+                  <pic:spPr>
+                    <a:xfrm>
+                      <a:off x="0" y="0"/>
+                      <a:ext cx="5349240" cy="389408"/>
+                    </a:xfrm>
+                    <a:prstGeom prst="rect"/>
+                  </pic:spPr>
+                </pic:pic>
+              </a:graphicData>
+            </a:graphic>
+          </wp:inline>
+        </w:drawing>
+      </w:r>
+    </w:p>
+    <w:p>
+      <w:pPr>
+        <w:keepNext/>
+        <w:keepLines/>
+        <w:spacing w:before="80" w:after="40"/>
+      </w:pPr>
+      <w:r>
+        <w:rPr>
+          <w:rFonts w:ascii="Arial Unicode MS" w:hAnsi="Arial Unicode MS" w:eastAsia="Arial Unicode MS"/>
+          <w:b/>
+          <w:sz w:val="20"/>
+        </w:rPr>
+        <w:t>出場</w:t>
+      </w:r>
+    </w:p>
+    <w:p>
+      <w:pPr>
+        <w:keepLines/>
+        <w:spacing w:after="100"/>
+        <w:jc w:val="center"/>
+      </w:pPr>
+      <w:r>
+        <w:drawing>
+          <wp:inline xmlns:a="http://schemas.openxmlformats.org/drawingml/2006/main" xmlns:pic="http://schemas.openxmlformats.org/drawingml/2006/picture">
+            <wp:extent cx="5349240" cy="389408"/>
+            <wp:docPr id="7" name="Picture 7"/>
+            <wp:cNvGraphicFramePr>
+              <a:graphicFrameLocks noChangeAspect="1"/>
+            </wp:cNvGraphicFramePr>
+            <a:graphic>
+              <a:graphicData uri="http://schemas.openxmlformats.org/drawingml/2006/picture">
+                <pic:pic>
+                  <pic:nvPicPr>
+                    <pic:cNvPr id="0" name="problem1_07.png"/>
+                    <pic:cNvPicPr/>
+                  </pic:nvPicPr>
+                  <pic:blipFill>
+                    <a:blip r:embed="rId15"/>
+                    <a:stretch>
+                      <a:fillRect/>
+                    </a:stretch>
+                  </pic:blipFill>
+                  <pic:spPr>
+                    <a:xfrm>
+                      <a:off x="0" y="0"/>
+                      <a:ext cx="5349240" cy="389408"/>
+                    </a:xfrm>
+                    <a:prstGeom prst="rect"/>
+                  </pic:spPr>
+                </pic:pic>
+              </a:graphicData>
+            </a:graphic>
+          </wp:inline>
+        </w:drawing>
+      </w:r>
+    </w:p>
+    <w:p>
+      <w:pPr>
+        <w:keepNext/>
+        <w:keepLines/>
+        <w:spacing w:before="80" w:after="40"/>
+      </w:pPr>
+      <w:r>
+        <w:rPr>
+          <w:rFonts w:ascii="Arial Unicode MS" w:hAnsi="Arial Unicode MS" w:eastAsia="Arial Unicode MS"/>
+          <w:b/>
+          <w:sz w:val="20"/>
+        </w:rPr>
+        <w:t>進場</w:t>
+      </w:r>
+    </w:p>
+    <w:p>
+      <w:pPr>
+        <w:keepLines/>
+        <w:spacing w:after="100"/>
+        <w:jc w:val="center"/>
+      </w:pPr>
+      <w:r>
+        <w:drawing>
+          <wp:inline xmlns:a="http://schemas.openxmlformats.org/drawingml/2006/main" xmlns:pic="http://schemas.openxmlformats.org/drawingml/2006/picture">
+            <wp:extent cx="5349240" cy="389408"/>
+            <wp:docPr id="8" name="Picture 8"/>
+            <wp:cNvGraphicFramePr>
+              <a:graphicFrameLocks noChangeAspect="1"/>
+            </wp:cNvGraphicFramePr>
+            <a:graphic>
+              <a:graphicData uri="http://schemas.openxmlformats.org/drawingml/2006/picture">
+                <pic:pic>
+                  <pic:nvPicPr>
+                    <pic:cNvPr id="0" name="problem1_08.png"/>
+                    <pic:cNvPicPr/>
+                  </pic:nvPicPr>
+                  <pic:blipFill>
+                    <a:blip r:embed="rId16"/>
+                    <a:stretch>
+                      <a:fillRect/>
+                    </a:stretch>
+                  </pic:blipFill>
+                  <pic:spPr>
+                    <a:xfrm>
+                      <a:off x="0" y="0"/>
+                      <a:ext cx="5349240" cy="389408"/>
+                    </a:xfrm>
+                    <a:prstGeom prst="rect"/>
+                  </pic:spPr>
+                </pic:pic>
+              </a:graphicData>
+            </a:graphic>
+          </wp:inline>
+        </w:drawing>
+      </w:r>
+    </w:p>
+    <w:p>
+      <w:pPr>
+        <w:keepNext/>
+        <w:keepLines/>
+        <w:spacing w:before="80" w:after="40"/>
+      </w:pPr>
+      <w:r>
+        <w:rPr>
+          <w:rFonts w:ascii="Arial Unicode MS" w:hAnsi="Arial Unicode MS" w:eastAsia="Arial Unicode MS"/>
+          <w:b/>
+          <w:sz w:val="20"/>
+        </w:rPr>
+        <w:t>其他</w:t>
+      </w:r>
+    </w:p>
+    <w:p>
+      <w:pPr>
+        <w:keepLines/>
+        <w:spacing w:after="100"/>
+        <w:jc w:val="center"/>
+      </w:pPr>
+      <w:r>
+        <w:drawing>
+          <wp:inline xmlns:a="http://schemas.openxmlformats.org/drawingml/2006/main" xmlns:pic="http://schemas.openxmlformats.org/drawingml/2006/picture">
+            <wp:extent cx="5349240" cy="389408"/>
+            <wp:docPr id="9" name="Picture 9"/>
+            <wp:cNvGraphicFramePr>
+              <a:graphicFrameLocks noChangeAspect="1"/>
+            </wp:cNvGraphicFramePr>
+            <a:graphic>
+              <a:graphicData uri="http://schemas.openxmlformats.org/drawingml/2006/picture">
+                <pic:pic>
+                  <pic:nvPicPr>
+                    <pic:cNvPr id="0" name="problem1_09.png"/>
+                    <pic:cNvPicPr/>
+                  </pic:nvPicPr>
+                  <pic:blipFill>
+                    <a:blip r:embed="rId17"/>
+                    <a:stretch>
+                      <a:fillRect/>
+                    </a:stretch>
+                  </pic:blipFill>
+                  <pic:spPr>
+                    <a:xfrm>
+                      <a:off x="0" y="0"/>
+                      <a:ext cx="5349240" cy="389408"/>
+                    </a:xfrm>
+                    <a:prstGeom prst="rect"/>
+                  </pic:spPr>
+                </pic:pic>
+              </a:graphicData>
+            </a:graphic>
+          </wp:inline>
+        </w:drawing>
+      </w:r>
+    </w:p>
+    <w:p>
+      <w:pPr>
+        <w:keepNext/>
+        <w:keepLines/>
+        <w:spacing w:before="80" w:after="40"/>
+      </w:pPr>
+      <w:r>
+        <w:rPr>
+          <w:rFonts w:ascii="Arial Unicode MS" w:hAnsi="Arial Unicode MS" w:eastAsia="Arial Unicode MS"/>
+          <w:b/>
+          <w:sz w:val="20"/>
+        </w:rPr>
+        <w:t>資產更新</w:t>
+      </w:r>
+    </w:p>
+    <w:p>
+      <w:pPr>
+        <w:keepLines/>
+        <w:spacing w:after="100"/>
+        <w:jc w:val="center"/>
+      </w:pPr>
+      <w:r>
+        <w:drawing>
+          <wp:inline xmlns:a="http://schemas.openxmlformats.org/drawingml/2006/main" xmlns:pic="http://schemas.openxmlformats.org/drawingml/2006/picture">
+            <wp:extent cx="5349240" cy="389408"/>
+            <wp:docPr id="10" name="Picture 10"/>
+            <wp:cNvGraphicFramePr>
+              <a:graphicFrameLocks noChangeAspect="1"/>
+            </wp:cNvGraphicFramePr>
+            <a:graphic>
+              <a:graphicData uri="http://schemas.openxmlformats.org/drawingml/2006/picture">
+                <pic:pic>
+                  <pic:nvPicPr>
+                    <pic:cNvPr id="0" name="problem1_10.png"/>
+                    <pic:cNvPicPr/>
+                  </pic:nvPicPr>
+                  <pic:blipFill>
+                    <a:blip r:embed="rId18"/>
+                    <a:stretch>
+                      <a:fillRect/>
+                    </a:stretch>
+                  </pic:blipFill>
+                  <pic:spPr>
+                    <a:xfrm>
+                      <a:off x="0" y="0"/>
+                      <a:ext cx="5349240" cy="389408"/>
+                    </a:xfrm>
+                    <a:prstGeom prst="rect"/>
+                  </pic:spPr>
+                </pic:pic>
+              </a:graphicData>
+            </a:graphic>
+          </wp:inline>
+        </w:drawing>
+      </w:r>
+    </w:p>
+    <w:p>
+      <w:r>
+        <w:br w:type="page"/>
       </w:r>
     </w:p>
     <w:p>
@@ -1166,7 +1691,7 @@
         <w:drawing>
           <wp:inline xmlns:a="http://schemas.openxmlformats.org/drawingml/2006/main" xmlns:pic="http://schemas.openxmlformats.org/drawingml/2006/picture">
             <wp:extent cx="5623560" cy="2556164"/>
-            <wp:docPr id="2" name="Picture 2"/>
+            <wp:docPr id="11" name="Picture 11"/>
             <wp:cNvGraphicFramePr>
               <a:graphicFrameLocks noChangeAspect="1"/>
             </wp:cNvGraphicFramePr>
@@ -1178,7 +1703,7 @@
                     <pic:cNvPicPr/>
                   </pic:nvPicPr>
                   <pic:blipFill>
-                    <a:blip r:embed="rId10"/>
+                    <a:blip r:embed="rId19"/>
                     <a:stretch>
                       <a:fillRect/>
                     </a:stretch>
@@ -1298,7 +1823,7 @@
         <w:drawing>
           <wp:inline xmlns:a="http://schemas.openxmlformats.org/drawingml/2006/main" xmlns:pic="http://schemas.openxmlformats.org/drawingml/2006/picture">
             <wp:extent cx="5623560" cy="2556164"/>
-            <wp:docPr id="3" name="Picture 3"/>
+            <wp:docPr id="12" name="Picture 12"/>
             <wp:cNvGraphicFramePr>
               <a:graphicFrameLocks noChangeAspect="1"/>
             </wp:cNvGraphicFramePr>
@@ -1310,7 +1835,7 @@
                     <pic:cNvPicPr/>
                   </pic:nvPicPr>
                   <pic:blipFill>
-                    <a:blip r:embed="rId11"/>
+                    <a:blip r:embed="rId20"/>
                     <a:stretch>
                       <a:fillRect/>
                     </a:stretch>
@@ -1430,7 +1955,7 @@
         <w:drawing>
           <wp:inline xmlns:a="http://schemas.openxmlformats.org/drawingml/2006/main" xmlns:pic="http://schemas.openxmlformats.org/drawingml/2006/picture">
             <wp:extent cx="5623560" cy="2556164"/>
-            <wp:docPr id="4" name="Picture 4"/>
+            <wp:docPr id="13" name="Picture 13"/>
             <wp:cNvGraphicFramePr>
               <a:graphicFrameLocks noChangeAspect="1"/>
             </wp:cNvGraphicFramePr>
@@ -1442,7 +1967,7 @@
                     <pic:cNvPicPr/>
                   </pic:nvPicPr>
                   <pic:blipFill>
-                    <a:blip r:embed="rId12"/>
+                    <a:blip r:embed="rId21"/>
                     <a:stretch>
                       <a:fillRect/>
                     </a:stretch>
@@ -1562,7 +2087,7 @@
         <w:drawing>
           <wp:inline xmlns:a="http://schemas.openxmlformats.org/drawingml/2006/main" xmlns:pic="http://schemas.openxmlformats.org/drawingml/2006/picture">
             <wp:extent cx="5623560" cy="2556164"/>
-            <wp:docPr id="5" name="Picture 5"/>
+            <wp:docPr id="14" name="Picture 14"/>
             <wp:cNvGraphicFramePr>
               <a:graphicFrameLocks noChangeAspect="1"/>
             </wp:cNvGraphicFramePr>
@@ -1574,7 +2099,7 @@
                     <pic:cNvPicPr/>
                   </pic:nvPicPr>
                   <pic:blipFill>
-                    <a:blip r:embed="rId13"/>
+                    <a:blip r:embed="rId22"/>
                     <a:stretch>
                       <a:fillRect/>
                     </a:stretch>
@@ -1681,7 +2206,7 @@
         <w:drawing>
           <wp:inline xmlns:a="http://schemas.openxmlformats.org/drawingml/2006/main" xmlns:pic="http://schemas.openxmlformats.org/drawingml/2006/picture">
             <wp:extent cx="5623560" cy="2556164"/>
-            <wp:docPr id="6" name="Picture 6"/>
+            <wp:docPr id="15" name="Picture 15"/>
             <wp:cNvGraphicFramePr>
               <a:graphicFrameLocks noChangeAspect="1"/>
             </wp:cNvGraphicFramePr>
@@ -1693,7 +2218,7 @@
                     <pic:cNvPicPr/>
                   </pic:nvPicPr>
                   <pic:blipFill>
-                    <a:blip r:embed="rId14"/>
+                    <a:blip r:embed="rId23"/>
                     <a:stretch>
                       <a:fillRect/>
                     </a:stretch>
@@ -1799,13 +2324,43 @@
     </w:p>
     <w:p>
       <w:pPr>
+        <w:spacing w:after="160" w:line="276" w:lineRule="auto"/>
+      </w:pPr>
+      <w:r>
+        <w:rPr>
+          <w:rFonts w:ascii="Arial Unicode MS" w:hAnsi="Arial Unicode MS" w:eastAsia="Arial Unicode MS"/>
+          <w:b w:val="0"/>
+          <w:sz w:val="20"/>
+        </w:rPr>
+        <w:t>Problem 2 公式如下。文字說明維持 Word 原生排版，公式本身各自以單張 PNG 插入。</w:t>
+      </w:r>
+    </w:p>
+    <w:p>
+      <w:pPr>
+        <w:keepNext/>
+        <w:keepLines/>
+        <w:spacing w:before="80" w:after="40"/>
+      </w:pPr>
+      <w:r>
+        <w:rPr>
+          <w:rFonts w:ascii="Arial Unicode MS" w:hAnsi="Arial Unicode MS" w:eastAsia="Arial Unicode MS"/>
+          <w:b/>
+          <w:sz w:val="20"/>
+        </w:rPr>
+        <w:t>價格轉換</w:t>
+      </w:r>
+    </w:p>
+    <w:p>
+      <w:pPr>
+        <w:keepLines/>
+        <w:spacing w:after="100"/>
         <w:jc w:val="center"/>
       </w:pPr>
       <w:r>
         <w:drawing>
           <wp:inline xmlns:a="http://schemas.openxmlformats.org/drawingml/2006/main" xmlns:pic="http://schemas.openxmlformats.org/drawingml/2006/picture">
-            <wp:extent cx="5669280" cy="3990301"/>
-            <wp:docPr id="7" name="Picture 7"/>
+            <wp:extent cx="5349240" cy="389408"/>
+            <wp:docPr id="16" name="Picture 16"/>
             <wp:cNvGraphicFramePr>
               <a:graphicFrameLocks noChangeAspect="1"/>
             </wp:cNvGraphicFramePr>
@@ -1813,11 +2368,11 @@
               <a:graphicData uri="http://schemas.openxmlformats.org/drawingml/2006/picture">
                 <pic:pic>
                   <pic:nvPicPr>
-                    <pic:cNvPr id="0" name="problem2_rule_formula_sheet.png"/>
+                    <pic:cNvPr id="0" name="problem2_01.png"/>
                     <pic:cNvPicPr/>
                   </pic:nvPicPr>
                   <pic:blipFill>
-                    <a:blip r:embed="rId15"/>
+                    <a:blip r:embed="rId24"/>
                     <a:stretch>
                       <a:fillRect/>
                     </a:stretch>
@@ -1825,7 +2380,7 @@
                   <pic:spPr>
                     <a:xfrm>
                       <a:off x="0" y="0"/>
-                      <a:ext cx="5669280" cy="3990301"/>
+                      <a:ext cx="5349240" cy="389408"/>
                     </a:xfrm>
                     <a:prstGeom prst="rect"/>
                   </pic:spPr>
@@ -1838,16 +2393,506 @@
     </w:p>
     <w:p>
       <w:pPr>
-        <w:spacing w:after="160"/>
-        <w:jc w:val="center"/>
+        <w:keepNext/>
+        <w:keepLines/>
+        <w:spacing w:before="80" w:after="40"/>
       </w:pPr>
       <w:r>
         <w:rPr>
           <w:rFonts w:ascii="Arial Unicode MS" w:hAnsi="Arial Unicode MS" w:eastAsia="Arial Unicode MS"/>
-          <w:i/>
-          <w:sz w:val="18"/>
+          <w:b/>
+          <w:sz w:val="20"/>
         </w:rPr>
-        <w:t>圖 2：Problem 2 配對交易公式。</w:t>
+        <w:t>配對迴歸</w:t>
+      </w:r>
+    </w:p>
+    <w:p>
+      <w:pPr>
+        <w:keepLines/>
+        <w:spacing w:after="100"/>
+        <w:jc w:val="center"/>
+      </w:pPr>
+      <w:r>
+        <w:drawing>
+          <wp:inline xmlns:a="http://schemas.openxmlformats.org/drawingml/2006/main" xmlns:pic="http://schemas.openxmlformats.org/drawingml/2006/picture">
+            <wp:extent cx="5349240" cy="389408"/>
+            <wp:docPr id="17" name="Picture 17"/>
+            <wp:cNvGraphicFramePr>
+              <a:graphicFrameLocks noChangeAspect="1"/>
+            </wp:cNvGraphicFramePr>
+            <a:graphic>
+              <a:graphicData uri="http://schemas.openxmlformats.org/drawingml/2006/picture">
+                <pic:pic>
+                  <pic:nvPicPr>
+                    <pic:cNvPr id="0" name="problem2_02.png"/>
+                    <pic:cNvPicPr/>
+                  </pic:nvPicPr>
+                  <pic:blipFill>
+                    <a:blip r:embed="rId25"/>
+                    <a:stretch>
+                      <a:fillRect/>
+                    </a:stretch>
+                  </pic:blipFill>
+                  <pic:spPr>
+                    <a:xfrm>
+                      <a:off x="0" y="0"/>
+                      <a:ext cx="5349240" cy="389408"/>
+                    </a:xfrm>
+                    <a:prstGeom prst="rect"/>
+                  </pic:spPr>
+                </pic:pic>
+              </a:graphicData>
+            </a:graphic>
+          </wp:inline>
+        </w:drawing>
+      </w:r>
+    </w:p>
+    <w:p>
+      <w:pPr>
+        <w:keepNext/>
+        <w:keepLines/>
+        <w:spacing w:before="80" w:after="40"/>
+      </w:pPr>
+      <w:r>
+        <w:rPr>
+          <w:rFonts w:ascii="Arial Unicode MS" w:hAnsi="Arial Unicode MS" w:eastAsia="Arial Unicode MS"/>
+          <w:b/>
+          <w:sz w:val="20"/>
+        </w:rPr>
+        <w:t>價差</w:t>
+      </w:r>
+    </w:p>
+    <w:p>
+      <w:pPr>
+        <w:keepLines/>
+        <w:spacing w:after="100"/>
+        <w:jc w:val="center"/>
+      </w:pPr>
+      <w:r>
+        <w:drawing>
+          <wp:inline xmlns:a="http://schemas.openxmlformats.org/drawingml/2006/main" xmlns:pic="http://schemas.openxmlformats.org/drawingml/2006/picture">
+            <wp:extent cx="5349240" cy="389408"/>
+            <wp:docPr id="18" name="Picture 18"/>
+            <wp:cNvGraphicFramePr>
+              <a:graphicFrameLocks noChangeAspect="1"/>
+            </wp:cNvGraphicFramePr>
+            <a:graphic>
+              <a:graphicData uri="http://schemas.openxmlformats.org/drawingml/2006/picture">
+                <pic:pic>
+                  <pic:nvPicPr>
+                    <pic:cNvPr id="0" name="problem2_03.png"/>
+                    <pic:cNvPicPr/>
+                  </pic:nvPicPr>
+                  <pic:blipFill>
+                    <a:blip r:embed="rId26"/>
+                    <a:stretch>
+                      <a:fillRect/>
+                    </a:stretch>
+                  </pic:blipFill>
+                  <pic:spPr>
+                    <a:xfrm>
+                      <a:off x="0" y="0"/>
+                      <a:ext cx="5349240" cy="389408"/>
+                    </a:xfrm>
+                    <a:prstGeom prst="rect"/>
+                  </pic:spPr>
+                </pic:pic>
+              </a:graphicData>
+            </a:graphic>
+          </wp:inline>
+        </w:drawing>
+      </w:r>
+    </w:p>
+    <w:p>
+      <w:pPr>
+        <w:keepNext/>
+        <w:keepLines/>
+        <w:spacing w:before="80" w:after="40"/>
+      </w:pPr>
+      <w:r>
+        <w:rPr>
+          <w:rFonts w:ascii="Arial Unicode MS" w:hAnsi="Arial Unicode MS" w:eastAsia="Arial Unicode MS"/>
+          <w:b/>
+          <w:sz w:val="20"/>
+        </w:rPr>
+        <w:t>標準化分數</w:t>
+      </w:r>
+    </w:p>
+    <w:p>
+      <w:pPr>
+        <w:keepLines/>
+        <w:spacing w:after="100"/>
+        <w:jc w:val="center"/>
+      </w:pPr>
+      <w:r>
+        <w:drawing>
+          <wp:inline xmlns:a="http://schemas.openxmlformats.org/drawingml/2006/main" xmlns:pic="http://schemas.openxmlformats.org/drawingml/2006/picture">
+            <wp:extent cx="5349240" cy="389408"/>
+            <wp:docPr id="19" name="Picture 19"/>
+            <wp:cNvGraphicFramePr>
+              <a:graphicFrameLocks noChangeAspect="1"/>
+            </wp:cNvGraphicFramePr>
+            <a:graphic>
+              <a:graphicData uri="http://schemas.openxmlformats.org/drawingml/2006/picture">
+                <pic:pic>
+                  <pic:nvPicPr>
+                    <pic:cNvPr id="0" name="problem2_04.png"/>
+                    <pic:cNvPicPr/>
+                  </pic:nvPicPr>
+                  <pic:blipFill>
+                    <a:blip r:embed="rId27"/>
+                    <a:stretch>
+                      <a:fillRect/>
+                    </a:stretch>
+                  </pic:blipFill>
+                  <pic:spPr>
+                    <a:xfrm>
+                      <a:off x="0" y="0"/>
+                      <a:ext cx="5349240" cy="389408"/>
+                    </a:xfrm>
+                    <a:prstGeom prst="rect"/>
+                  </pic:spPr>
+                </pic:pic>
+              </a:graphicData>
+            </a:graphic>
+          </wp:inline>
+        </w:drawing>
+      </w:r>
+    </w:p>
+    <w:p>
+      <w:pPr>
+        <w:keepNext/>
+        <w:keepLines/>
+        <w:spacing w:before="80" w:after="40"/>
+      </w:pPr>
+      <w:r>
+        <w:rPr>
+          <w:rFonts w:ascii="Arial Unicode MS" w:hAnsi="Arial Unicode MS" w:eastAsia="Arial Unicode MS"/>
+          <w:b/>
+          <w:sz w:val="20"/>
+        </w:rPr>
+        <w:t>Fixed 參數</w:t>
+      </w:r>
+    </w:p>
+    <w:p>
+      <w:pPr>
+        <w:keepLines/>
+        <w:spacing w:after="100"/>
+        <w:jc w:val="center"/>
+      </w:pPr>
+      <w:r>
+        <w:drawing>
+          <wp:inline xmlns:a="http://schemas.openxmlformats.org/drawingml/2006/main" xmlns:pic="http://schemas.openxmlformats.org/drawingml/2006/picture">
+            <wp:extent cx="5349240" cy="389408"/>
+            <wp:docPr id="20" name="Picture 20"/>
+            <wp:cNvGraphicFramePr>
+              <a:graphicFrameLocks noChangeAspect="1"/>
+            </wp:cNvGraphicFramePr>
+            <a:graphic>
+              <a:graphicData uri="http://schemas.openxmlformats.org/drawingml/2006/picture">
+                <pic:pic>
+                  <pic:nvPicPr>
+                    <pic:cNvPr id="0" name="problem2_05.png"/>
+                    <pic:cNvPicPr/>
+                  </pic:nvPicPr>
+                  <pic:blipFill>
+                    <a:blip r:embed="rId28"/>
+                    <a:stretch>
+                      <a:fillRect/>
+                    </a:stretch>
+                  </pic:blipFill>
+                  <pic:spPr>
+                    <a:xfrm>
+                      <a:off x="0" y="0"/>
+                      <a:ext cx="5349240" cy="389408"/>
+                    </a:xfrm>
+                    <a:prstGeom prst="rect"/>
+                  </pic:spPr>
+                </pic:pic>
+              </a:graphicData>
+            </a:graphic>
+          </wp:inline>
+        </w:drawing>
+      </w:r>
+    </w:p>
+    <w:p>
+      <w:pPr>
+        <w:keepNext/>
+        <w:keepLines/>
+        <w:spacing w:before="80" w:after="40"/>
+      </w:pPr>
+      <w:r>
+        <w:rPr>
+          <w:rFonts w:ascii="Arial Unicode MS" w:hAnsi="Arial Unicode MS" w:eastAsia="Arial Unicode MS"/>
+          <w:b/>
+          <w:sz w:val="20"/>
+        </w:rPr>
+        <w:t>Long spread</w:t>
+      </w:r>
+    </w:p>
+    <w:p>
+      <w:pPr>
+        <w:keepLines/>
+        <w:spacing w:after="100"/>
+        <w:jc w:val="center"/>
+      </w:pPr>
+      <w:r>
+        <w:drawing>
+          <wp:inline xmlns:a="http://schemas.openxmlformats.org/drawingml/2006/main" xmlns:pic="http://schemas.openxmlformats.org/drawingml/2006/picture">
+            <wp:extent cx="5349240" cy="389408"/>
+            <wp:docPr id="21" name="Picture 21"/>
+            <wp:cNvGraphicFramePr>
+              <a:graphicFrameLocks noChangeAspect="1"/>
+            </wp:cNvGraphicFramePr>
+            <a:graphic>
+              <a:graphicData uri="http://schemas.openxmlformats.org/drawingml/2006/picture">
+                <pic:pic>
+                  <pic:nvPicPr>
+                    <pic:cNvPr id="0" name="problem2_06.png"/>
+                    <pic:cNvPicPr/>
+                  </pic:nvPicPr>
+                  <pic:blipFill>
+                    <a:blip r:embed="rId29"/>
+                    <a:stretch>
+                      <a:fillRect/>
+                    </a:stretch>
+                  </pic:blipFill>
+                  <pic:spPr>
+                    <a:xfrm>
+                      <a:off x="0" y="0"/>
+                      <a:ext cx="5349240" cy="389408"/>
+                    </a:xfrm>
+                    <a:prstGeom prst="rect"/>
+                  </pic:spPr>
+                </pic:pic>
+              </a:graphicData>
+            </a:graphic>
+          </wp:inline>
+        </w:drawing>
+      </w:r>
+    </w:p>
+    <w:p>
+      <w:pPr>
+        <w:keepNext/>
+        <w:keepLines/>
+        <w:spacing w:before="80" w:after="40"/>
+      </w:pPr>
+      <w:r>
+        <w:rPr>
+          <w:rFonts w:ascii="Arial Unicode MS" w:hAnsi="Arial Unicode MS" w:eastAsia="Arial Unicode MS"/>
+          <w:b/>
+          <w:sz w:val="20"/>
+        </w:rPr>
+        <w:t>Short spread</w:t>
+      </w:r>
+    </w:p>
+    <w:p>
+      <w:pPr>
+        <w:keepLines/>
+        <w:spacing w:after="100"/>
+        <w:jc w:val="center"/>
+      </w:pPr>
+      <w:r>
+        <w:drawing>
+          <wp:inline xmlns:a="http://schemas.openxmlformats.org/drawingml/2006/main" xmlns:pic="http://schemas.openxmlformats.org/drawingml/2006/picture">
+            <wp:extent cx="5349240" cy="389408"/>
+            <wp:docPr id="22" name="Picture 22"/>
+            <wp:cNvGraphicFramePr>
+              <a:graphicFrameLocks noChangeAspect="1"/>
+            </wp:cNvGraphicFramePr>
+            <a:graphic>
+              <a:graphicData uri="http://schemas.openxmlformats.org/drawingml/2006/picture">
+                <pic:pic>
+                  <pic:nvPicPr>
+                    <pic:cNvPr id="0" name="problem2_07.png"/>
+                    <pic:cNvPicPr/>
+                  </pic:nvPicPr>
+                  <pic:blipFill>
+                    <a:blip r:embed="rId30"/>
+                    <a:stretch>
+                      <a:fillRect/>
+                    </a:stretch>
+                  </pic:blipFill>
+                  <pic:spPr>
+                    <a:xfrm>
+                      <a:off x="0" y="0"/>
+                      <a:ext cx="5349240" cy="389408"/>
+                    </a:xfrm>
+                    <a:prstGeom prst="rect"/>
+                  </pic:spPr>
+                </pic:pic>
+              </a:graphicData>
+            </a:graphic>
+          </wp:inline>
+        </w:drawing>
+      </w:r>
+    </w:p>
+    <w:p>
+      <w:pPr>
+        <w:keepNext/>
+        <w:keepLines/>
+        <w:spacing w:before="80" w:after="40"/>
+      </w:pPr>
+      <w:r>
+        <w:rPr>
+          <w:rFonts w:ascii="Arial Unicode MS" w:hAnsi="Arial Unicode MS" w:eastAsia="Arial Unicode MS"/>
+          <w:b/>
+          <w:sz w:val="20"/>
+        </w:rPr>
+        <w:t>均值回歸出場</w:t>
+      </w:r>
+    </w:p>
+    <w:p>
+      <w:pPr>
+        <w:keepLines/>
+        <w:spacing w:after="100"/>
+        <w:jc w:val="center"/>
+      </w:pPr>
+      <w:r>
+        <w:drawing>
+          <wp:inline xmlns:a="http://schemas.openxmlformats.org/drawingml/2006/main" xmlns:pic="http://schemas.openxmlformats.org/drawingml/2006/picture">
+            <wp:extent cx="5349240" cy="389408"/>
+            <wp:docPr id="23" name="Picture 23"/>
+            <wp:cNvGraphicFramePr>
+              <a:graphicFrameLocks noChangeAspect="1"/>
+            </wp:cNvGraphicFramePr>
+            <a:graphic>
+              <a:graphicData uri="http://schemas.openxmlformats.org/drawingml/2006/picture">
+                <pic:pic>
+                  <pic:nvPicPr>
+                    <pic:cNvPr id="0" name="problem2_08.png"/>
+                    <pic:cNvPicPr/>
+                  </pic:nvPicPr>
+                  <pic:blipFill>
+                    <a:blip r:embed="rId31"/>
+                    <a:stretch>
+                      <a:fillRect/>
+                    </a:stretch>
+                  </pic:blipFill>
+                  <pic:spPr>
+                    <a:xfrm>
+                      <a:off x="0" y="0"/>
+                      <a:ext cx="5349240" cy="389408"/>
+                    </a:xfrm>
+                    <a:prstGeom prst="rect"/>
+                  </pic:spPr>
+                </pic:pic>
+              </a:graphicData>
+            </a:graphic>
+          </wp:inline>
+        </w:drawing>
+      </w:r>
+    </w:p>
+    <w:p>
+      <w:pPr>
+        <w:keepNext/>
+        <w:keepLines/>
+        <w:spacing w:before="80" w:after="40"/>
+      </w:pPr>
+      <w:r>
+        <w:rPr>
+          <w:rFonts w:ascii="Arial Unicode MS" w:hAnsi="Arial Unicode MS" w:eastAsia="Arial Unicode MS"/>
+          <w:b/>
+          <w:sz w:val="20"/>
+        </w:rPr>
+        <w:t>風控</w:t>
+      </w:r>
+    </w:p>
+    <w:p>
+      <w:pPr>
+        <w:keepLines/>
+        <w:spacing w:after="100"/>
+        <w:jc w:val="center"/>
+      </w:pPr>
+      <w:r>
+        <w:drawing>
+          <wp:inline xmlns:a="http://schemas.openxmlformats.org/drawingml/2006/main" xmlns:pic="http://schemas.openxmlformats.org/drawingml/2006/picture">
+            <wp:extent cx="5349240" cy="389408"/>
+            <wp:docPr id="24" name="Picture 24"/>
+            <wp:cNvGraphicFramePr>
+              <a:graphicFrameLocks noChangeAspect="1"/>
+            </wp:cNvGraphicFramePr>
+            <a:graphic>
+              <a:graphicData uri="http://schemas.openxmlformats.org/drawingml/2006/picture">
+                <pic:pic>
+                  <pic:nvPicPr>
+                    <pic:cNvPr id="0" name="problem2_09.png"/>
+                    <pic:cNvPicPr/>
+                  </pic:nvPicPr>
+                  <pic:blipFill>
+                    <a:blip r:embed="rId32"/>
+                    <a:stretch>
+                      <a:fillRect/>
+                    </a:stretch>
+                  </pic:blipFill>
+                  <pic:spPr>
+                    <a:xfrm>
+                      <a:off x="0" y="0"/>
+                      <a:ext cx="5349240" cy="389408"/>
+                    </a:xfrm>
+                    <a:prstGeom prst="rect"/>
+                  </pic:spPr>
+                </pic:pic>
+              </a:graphicData>
+            </a:graphic>
+          </wp:inline>
+        </w:drawing>
+      </w:r>
+    </w:p>
+    <w:p>
+      <w:pPr>
+        <w:keepNext/>
+        <w:keepLines/>
+        <w:spacing w:before="80" w:after="40"/>
+      </w:pPr>
+      <w:r>
+        <w:rPr>
+          <w:rFonts w:ascii="Arial Unicode MS" w:hAnsi="Arial Unicode MS" w:eastAsia="Arial Unicode MS"/>
+          <w:b/>
+          <w:sz w:val="20"/>
+        </w:rPr>
+        <w:t>GA 搜尋</w:t>
+      </w:r>
+    </w:p>
+    <w:p>
+      <w:pPr>
+        <w:keepLines/>
+        <w:spacing w:after="100"/>
+        <w:jc w:val="center"/>
+      </w:pPr>
+      <w:r>
+        <w:drawing>
+          <wp:inline xmlns:a="http://schemas.openxmlformats.org/drawingml/2006/main" xmlns:pic="http://schemas.openxmlformats.org/drawingml/2006/picture">
+            <wp:extent cx="5349240" cy="389408"/>
+            <wp:docPr id="25" name="Picture 25"/>
+            <wp:cNvGraphicFramePr>
+              <a:graphicFrameLocks noChangeAspect="1"/>
+            </wp:cNvGraphicFramePr>
+            <a:graphic>
+              <a:graphicData uri="http://schemas.openxmlformats.org/drawingml/2006/picture">
+                <pic:pic>
+                  <pic:nvPicPr>
+                    <pic:cNvPr id="0" name="problem2_10.png"/>
+                    <pic:cNvPicPr/>
+                  </pic:nvPicPr>
+                  <pic:blipFill>
+                    <a:blip r:embed="rId33"/>
+                    <a:stretch>
+                      <a:fillRect/>
+                    </a:stretch>
+                  </pic:blipFill>
+                  <pic:spPr>
+                    <a:xfrm>
+                      <a:off x="0" y="0"/>
+                      <a:ext cx="5349240" cy="389408"/>
+                    </a:xfrm>
+                    <a:prstGeom prst="rect"/>
+                  </pic:spPr>
+                </pic:pic>
+              </a:graphicData>
+            </a:graphic>
+          </wp:inline>
+        </w:drawing>
       </w:r>
     </w:p>
     <w:p>
@@ -2421,7 +3466,7 @@
         <w:drawing>
           <wp:inline xmlns:a="http://schemas.openxmlformats.org/drawingml/2006/main" xmlns:pic="http://schemas.openxmlformats.org/drawingml/2006/picture">
             <wp:extent cx="5623560" cy="1874520"/>
-            <wp:docPr id="8" name="Picture 8"/>
+            <wp:docPr id="26" name="Picture 26"/>
             <wp:cNvGraphicFramePr>
               <a:graphicFrameLocks noChangeAspect="1"/>
             </wp:cNvGraphicFramePr>
@@ -2433,7 +3478,7 @@
                     <pic:cNvPicPr/>
                   </pic:nvPicPr>
                   <pic:blipFill>
-                    <a:blip r:embed="rId16"/>
+                    <a:blip r:embed="rId34"/>
                     <a:stretch>
                       <a:fillRect/>
                     </a:stretch>
@@ -2474,7 +3519,7 @@
         <w:drawing>
           <wp:inline xmlns:a="http://schemas.openxmlformats.org/drawingml/2006/main" xmlns:pic="http://schemas.openxmlformats.org/drawingml/2006/picture">
             <wp:extent cx="5623560" cy="4217670"/>
-            <wp:docPr id="9" name="Picture 9"/>
+            <wp:docPr id="27" name="Picture 27"/>
             <wp:cNvGraphicFramePr>
               <a:graphicFrameLocks noChangeAspect="1"/>
             </wp:cNvGraphicFramePr>
@@ -2486,7 +3531,7 @@
                     <pic:cNvPicPr/>
                   </pic:nvPicPr>
                   <pic:blipFill>
-                    <a:blip r:embed="rId17"/>
+                    <a:blip r:embed="rId35"/>
                     <a:stretch>
                       <a:fillRect/>
                     </a:stretch>

</xml_diff>